<commit_message>
Remove capa da documentacao e adiciona README do projeto
</commit_message>
<xml_diff>
--- a/documentacao_projeto.docx
+++ b/documentacao_projeto.docx
@@ -4,41 +4,7 @@
   <w:body>
     <w:p>
       <w:pPr>
-        <w:spacing w:after="1200"/>
-      </w:pPr>
-    </w:p>
-    <w:p>
-      <w:pPr>
-        <w:jc w:val="center"/>
-      </w:pPr>
-      <w:r>
-        <w:rPr>
-          <w:rFonts w:ascii="Calibri" w:cs="Calibri" w:eastAsia="Calibri" w:hAnsi="Calibri"/>
-          <w:b/>
-          <w:bCs/>
-          <w:sz w:val="24"/>
-          <w:szCs w:val="24"/>
-        </w:rPr>
-        <w:t xml:space="preserve">[NOME DA INSTITUIÇÃO DE ENSINO]</w:t>
-      </w:r>
-    </w:p>
-    <w:p>
-      <w:pPr>
-        <w:spacing w:after="1600"/>
-        <w:jc w:val="center"/>
-      </w:pPr>
-      <w:r>
-        <w:rPr>
-          <w:rFonts w:ascii="Calibri" w:cs="Calibri" w:eastAsia="Calibri" w:hAnsi="Calibri"/>
-          <w:sz w:val="22"/>
-          <w:szCs w:val="22"/>
-        </w:rPr>
-        <w:t xml:space="preserve">[Curso — ex.: Ciência da Computação / Engenharia de Software]</w:t>
-      </w:r>
-    </w:p>
-    <w:p>
-      <w:pPr>
-        <w:spacing w:after="200"/>
+        <w:spacing w:after="100"/>
         <w:jc w:val="center"/>
       </w:pPr>
       <w:r>
@@ -47,16 +13,15 @@
           <w:b/>
           <w:bCs/>
           <w:color w:val="1F4E79"/>
-          <w:sz w:val="34"/>
-          <w:szCs w:val="34"/>
-        </w:rPr>
-        <w:t xml:space="preserve">CALCULADORA DE SIMULAÇÃO DE INVESTIMENTO
-COM RENDIMENTO SIMPLES</w:t>
-      </w:r>
-    </w:p>
-    <w:p>
-      <w:pPr>
-        <w:spacing w:after="1800"/>
+          <w:sz w:val="32"/>
+          <w:szCs w:val="32"/>
+        </w:rPr>
+        <w:t xml:space="preserve">CALCULADORA DE SIMULAÇÃO DE INVESTIMENTO COM RENDIMENTO SIMPLES</w:t>
+      </w:r>
+    </w:p>
+    <w:p>
+      <w:pPr>
+        <w:spacing w:after="400"/>
         <w:jc w:val="center"/>
       </w:pPr>
       <w:r>
@@ -67,67 +32,7 @@
           <w:sz w:val="22"/>
           <w:szCs w:val="22"/>
         </w:rPr>
-        <w:t xml:space="preserve">Documentação de Projeto Acadêmico</w:t>
-      </w:r>
-    </w:p>
-    <w:p>
-      <w:pPr>
-        <w:spacing w:after="100"/>
-        <w:jc w:val="center"/>
-      </w:pPr>
-      <w:r>
-        <w:rPr>
-          <w:rFonts w:ascii="Calibri" w:cs="Calibri" w:eastAsia="Calibri" w:hAnsi="Calibri"/>
-          <w:sz w:val="22"/>
-          <w:szCs w:val="22"/>
-        </w:rPr>
-        <w:t xml:space="preserve">Autor(a): [Nome do(a) aluno(a)]</w:t>
-      </w:r>
-    </w:p>
-    <w:p>
-      <w:pPr>
-        <w:spacing w:after="100"/>
-        <w:jc w:val="center"/>
-      </w:pPr>
-      <w:r>
-        <w:rPr>
-          <w:rFonts w:ascii="Calibri" w:cs="Calibri" w:eastAsia="Calibri" w:hAnsi="Calibri"/>
-          <w:sz w:val="22"/>
-          <w:szCs w:val="22"/>
-        </w:rPr>
-        <w:t xml:space="preserve">Disciplina: [Nome da disciplina]</w:t>
-      </w:r>
-    </w:p>
-    <w:p>
-      <w:pPr>
-        <w:spacing w:after="1600"/>
-        <w:jc w:val="center"/>
-      </w:pPr>
-      <w:r>
-        <w:rPr>
-          <w:rFonts w:ascii="Calibri" w:cs="Calibri" w:eastAsia="Calibri" w:hAnsi="Calibri"/>
-          <w:sz w:val="22"/>
-          <w:szCs w:val="22"/>
-        </w:rPr>
-        <w:t xml:space="preserve">Professor(a) orientador(a): [Nome do(a) professor(a)]</w:t>
-      </w:r>
-    </w:p>
-    <w:p>
-      <w:pPr>
-        <w:jc w:val="center"/>
-      </w:pPr>
-      <w:r>
-        <w:rPr>
-          <w:rFonts w:ascii="Calibri" w:cs="Calibri" w:eastAsia="Calibri" w:hAnsi="Calibri"/>
-          <w:sz w:val="22"/>
-          <w:szCs w:val="22"/>
-        </w:rPr>
-        <w:t xml:space="preserve">[Cidade] — [Ano]</w:t>
-      </w:r>
-    </w:p>
-    <w:p>
-      <w:r>
-        <w:br w:type="page"/>
+        <w:t xml:space="preserve">Documentação Técnica do Projeto</w:t>
       </w:r>
     </w:p>
     <w:p>

</xml_diff>